<commit_message>
Added Signup Form test
</commit_message>
<xml_diff>
--- a/Resources.docx
+++ b/Resources.docx
@@ -244,7 +244,21 @@
         <w:rPr>
           <w:color w:val="00B050"/>
         </w:rPr>
-        <w:t>&lt;maven.compiler.source&gt;11&lt;/maven.compiler.source&gt;</w:t>
+        <w:t>&lt;maven.compiler.source&gt;</w:t>
+      </w:r>
+      <w:proofErr w:type="gramStart"/>
+      <w:r>
+        <w:rPr>
+          <w:color w:val="00B050"/>
+        </w:rPr>
+        <w:t>11</w:t>
+      </w:r>
+      <w:proofErr w:type="gramEnd"/>
+      <w:r>
+        <w:rPr>
+          <w:color w:val="00B050"/>
+        </w:rPr>
+        <w:t>&lt;/maven.compiler.source&gt;</w:t>
       </w:r>
     </w:p>
     <w:p>
@@ -271,7 +285,21 @@
         <w:rPr>
           <w:color w:val="00B050"/>
         </w:rPr>
-        <w:t>&lt;maven.compiler.target&gt;11&lt;/maven.compiler.target&gt;</w:t>
+        <w:t>&lt;maven.compiler.target&gt;</w:t>
+      </w:r>
+      <w:proofErr w:type="gramStart"/>
+      <w:r>
+        <w:rPr>
+          <w:color w:val="00B050"/>
+        </w:rPr>
+        <w:t>11</w:t>
+      </w:r>
+      <w:proofErr w:type="gramEnd"/>
+      <w:r>
+        <w:rPr>
+          <w:color w:val="00B050"/>
+        </w:rPr>
+        <w:t>&lt;/maven.compiler.target&gt;</w:t>
       </w:r>
     </w:p>
     <w:p>
@@ -386,6 +414,106 @@
         </w:rPr>
         <w:t xml:space="preserve"> &lt;/dependency&gt; </w:t>
       </w:r>
+    </w:p>
+    <w:p>
+      <w:pPr>
+        <w:ind w:left="1440" w:firstLine="720"/>
+        <w:rPr>
+          <w:color w:val="00B050"/>
+        </w:rPr>
+      </w:pPr>
+    </w:p>
+    <w:p>
+      <w:pPr>
+        <w:ind w:left="1440" w:firstLine="720"/>
+        <w:rPr>
+          <w:color w:val="00B050"/>
+        </w:rPr>
+      </w:pPr>
+      <w:r>
+        <w:rPr>
+          <w:color w:val="00B050"/>
+        </w:rPr>
+        <w:t>&lt;!-- JUnit --&gt;</w:t>
+      </w:r>
+    </w:p>
+    <w:p>
+      <w:pPr>
+        <w:ind w:left="1440" w:firstLine="720"/>
+        <w:rPr>
+          <w:color w:val="00B050"/>
+        </w:rPr>
+      </w:pPr>
+      <w:r>
+        <w:rPr>
+          <w:color w:val="00B050"/>
+        </w:rPr>
+        <w:t xml:space="preserve">    &lt;dependency&gt;</w:t>
+      </w:r>
+    </w:p>
+    <w:p>
+      <w:pPr>
+        <w:ind w:left="1440" w:firstLine="720"/>
+        <w:rPr>
+          <w:color w:val="00B050"/>
+        </w:rPr>
+      </w:pPr>
+      <w:r>
+        <w:rPr>
+          <w:color w:val="00B050"/>
+        </w:rPr>
+        <w:t xml:space="preserve">        &lt;groupId&gt;org.junit.jupiter&lt;/groupId&gt;</w:t>
+      </w:r>
+    </w:p>
+    <w:p>
+      <w:pPr>
+        <w:ind w:left="1440" w:firstLine="720"/>
+        <w:rPr>
+          <w:color w:val="00B050"/>
+        </w:rPr>
+      </w:pPr>
+      <w:r>
+        <w:rPr>
+          <w:color w:val="00B050"/>
+        </w:rPr>
+        <w:t xml:space="preserve">        &lt;artifactId&gt;junit-jupiter&lt;/artifactId&gt;</w:t>
+      </w:r>
+    </w:p>
+    <w:p>
+      <w:pPr>
+        <w:ind w:left="1440" w:firstLine="720"/>
+        <w:rPr>
+          <w:color w:val="00B050"/>
+        </w:rPr>
+      </w:pPr>
+      <w:r>
+        <w:rPr>
+          <w:color w:val="00B050"/>
+        </w:rPr>
+        <w:t xml:space="preserve">        &lt;version&gt;5.10.0&lt;/version&gt;</w:t>
+      </w:r>
+    </w:p>
+    <w:p>
+      <w:pPr>
+        <w:ind w:left="1440" w:firstLine="720"/>
+        <w:rPr>
+          <w:color w:val="00B050"/>
+        </w:rPr>
+      </w:pPr>
+      <w:r>
+        <w:rPr>
+          <w:color w:val="00B050"/>
+        </w:rPr>
+        <w:t xml:space="preserve">    &lt;/dependency&gt;</w:t>
+      </w:r>
+    </w:p>
+    <w:p>
+      <w:pPr>
+        <w:ind w:left="1440" w:firstLine="720"/>
+        <w:rPr>
+          <w:color w:val="00B050"/>
+        </w:rPr>
+      </w:pPr>
     </w:p>
     <w:p>
       <w:pPr>
@@ -426,7 +554,18 @@
         </w:numPr>
       </w:pPr>
       <w:r>
-        <w:t xml:space="preserve">IN THE END, ADD ALL EXAMPLE JAVA FILES TO SELENIUM LEARNING ON GOOGLE DRIVE. </w:t>
+        <w:t xml:space="preserve">IN THE END, </w:t>
+      </w:r>
+      <w:r>
+        <w:t xml:space="preserve">push to </w:t>
+      </w:r>
+      <w:proofErr w:type="spellStart"/>
+      <w:r>
+        <w:t>github</w:t>
+      </w:r>
+      <w:proofErr w:type="spellEnd"/>
+      <w:r>
+        <w:t xml:space="preserve"> </w:t>
       </w:r>
     </w:p>
     <w:p>
@@ -1256,7 +1395,6 @@
   <w:style w:type="character" w:default="1" w:styleId="DefaultParagraphFont">
     <w:name w:val="Default Paragraph Font"/>
     <w:uiPriority w:val="1"/>
-    <w:semiHidden/>
     <w:unhideWhenUsed/>
   </w:style>
   <w:style w:type="table" w:default="1" w:styleId="TableNormal">

</xml_diff>